<commit_message>
docs: simplifica referencias a la configuracion de WhatsApp
Co-Authored-By: Claude Sonnet 5.5 <noreply@anthropic.com>
</commit_message>
<xml_diff>
--- a/Fase 2/Evidencias Grupales/Ficha_Avance_04_HurryUp_v1.0_GRUPO06.docx
+++ b/Fase 2/Evidencias Grupales/Ficha_Avance_04_HurryUp_v1.0_GRUPO06.docx
@@ -7714,7 +7714,7 @@
                 <w:color w:val="000000"/>
                 <w:sz w:val="14"/>
               </w:rPr>
-              <w:t xml:space="preserve">Mantener operativa la integración con WhatsApp (cuenta de Meta y número ya configurados).</w:t>
+              <w:t xml:space="preserve">La integración con WhatsApp depende de la cuenta y el número de Meta, que ya están configurados.</w:t>
             </w:r>
           </w:p>
         </w:tc>
@@ -7748,7 +7748,7 @@
                 <w:color w:val="000000"/>
                 <w:sz w:val="14"/>
               </w:rPr>
-              <w:t xml:space="preserve">Si se pierde la configuración, el asistente deja de responder.</w:t>
+              <w:t xml:space="preserve">Si la configuración falla, el asistente deja de responder.</w:t>
             </w:r>
           </w:p>
         </w:tc>
@@ -7782,7 +7782,7 @@
                 <w:color w:val="000000"/>
                 <w:sz w:val="14"/>
               </w:rPr>
-              <w:t xml:space="preserve">Conservar el mismo número y la misma configuración de entorno, y probar el chat desde el botón del Marketplace.</w:t>
+              <w:t xml:space="preserve">Probar el chat desde el botón del Marketplace antes de cada demostración.</w:t>
             </w:r>
           </w:p>
         </w:tc>

</xml_diff>